<commit_message>
Add missing letter updates to paragraph numbers
</commit_message>
<xml_diff>
--- a/arches_her/docx/Condition Historic Building Recording Letter.docx
+++ b/arches_her/docx/Condition Historic Building Recording Letter.docx
@@ -955,7 +955,13 @@
         <w:rPr>
           <w:szCs w:val="24"/>
         </w:rPr>
-        <w:t>11</w:t>
+        <w:t>1</w:t>
+      </w:r>
+      <w:r>
+        <w:rPr>
+          <w:szCs w:val="24"/>
+        </w:rPr>
+        <w:t>8</w:t>
       </w:r>
       <w:r>
         <w:rPr>
@@ -2487,18 +2493,6 @@
 </file>
 
 <file path=customXml/item2.xml><?xml version="1.0" encoding="utf-8"?>
-<p:properties xmlns:p="http://schemas.microsoft.com/office/2006/metadata/properties" xmlns:xsi="http://www.w3.org/2001/XMLSchema-instance" xmlns:pc="http://schemas.microsoft.com/office/infopath/2007/PartnerControls">
-  <documentManagement>
-    <lcf76f155ced4ddcb4097134ff3c332f xmlns="06cfe00f-839a-4df9-b5c7-4ebac7d0c360">
-      <Terms xmlns="http://schemas.microsoft.com/office/infopath/2007/PartnerControls"/>
-    </lcf76f155ced4ddcb4097134ff3c332f>
-    <SoftwareVersion xmlns="06cfe00f-839a-4df9-b5c7-4ebac7d0c360">2.105.1143.0 64-bit (May 2022)</SoftwareVersion>
-    <TaxCatchAll xmlns="bb952b06-3268-4e55-b0fe-9eb49669fc08" xsi:nil="true"/>
-  </documentManagement>
-</p:properties>
-</file>
-
-<file path=customXml/item3.xml><?xml version="1.0" encoding="utf-8"?>
 <ct:contentTypeSchema xmlns:ct="http://schemas.microsoft.com/office/2006/metadata/contentType" xmlns:ma="http://schemas.microsoft.com/office/2006/metadata/properties/metaAttributes" ct:_="" ma:_="" ma:contentTypeName="Document" ma:contentTypeID="0x010100B414C6717266E74190F05281F89E6026" ma:contentTypeVersion="17" ma:contentTypeDescription="Create a new document." ma:contentTypeScope="" ma:versionID="2343acd8ed4986af9035717c377e987b">
   <xsd:schema xmlns:xsd="http://www.w3.org/2001/XMLSchema" xmlns:xs="http://www.w3.org/2001/XMLSchema" xmlns:p="http://schemas.microsoft.com/office/2006/metadata/properties" xmlns:ns2="06cfe00f-839a-4df9-b5c7-4ebac7d0c360" xmlns:ns3="610ec4a7-94b8-4d25-ad4b-84626814a18d" xmlns:ns4="bb952b06-3268-4e55-b0fe-9eb49669fc08" targetNamespace="http://schemas.microsoft.com/office/2006/metadata/properties" ma:root="true" ma:fieldsID="80560962e75b60efe544312e13b264a5" ns2:_="" ns3:_="" ns4:_="">
     <xsd:import namespace="06cfe00f-839a-4df9-b5c7-4ebac7d0c360"/>
@@ -2754,6 +2748,18 @@
 </ct:contentTypeSchema>
 </file>
 
+<file path=customXml/item3.xml><?xml version="1.0" encoding="utf-8"?>
+<p:properties xmlns:p="http://schemas.microsoft.com/office/2006/metadata/properties" xmlns:xsi="http://www.w3.org/2001/XMLSchema-instance" xmlns:pc="http://schemas.microsoft.com/office/infopath/2007/PartnerControls">
+  <documentManagement>
+    <lcf76f155ced4ddcb4097134ff3c332f xmlns="06cfe00f-839a-4df9-b5c7-4ebac7d0c360">
+      <Terms xmlns="http://schemas.microsoft.com/office/infopath/2007/PartnerControls"/>
+    </lcf76f155ced4ddcb4097134ff3c332f>
+    <SoftwareVersion xmlns="06cfe00f-839a-4df9-b5c7-4ebac7d0c360">2.105.1143.0 64-bit (May 2022)</SoftwareVersion>
+    <TaxCatchAll xmlns="bb952b06-3268-4e55-b0fe-9eb49669fc08" xsi:nil="true"/>
+  </documentManagement>
+</p:properties>
+</file>
+
 <file path=customXml/itemProps1.xml><?xml version="1.0" encoding="utf-8"?>
 <ds:datastoreItem xmlns:ds="http://schemas.openxmlformats.org/officeDocument/2006/customXml" ds:itemID="{8DAA71C7-6E28-4641-8A2B-3BD6B35E4619}">
   <ds:schemaRefs>
@@ -2763,17 +2769,6 @@
 </file>
 
 <file path=customXml/itemProps2.xml><?xml version="1.0" encoding="utf-8"?>
-<ds:datastoreItem xmlns:ds="http://schemas.openxmlformats.org/officeDocument/2006/customXml" ds:itemID="{5F3D02CF-878C-4FC7-BC50-B392CD9CCE23}">
-  <ds:schemaRefs>
-    <ds:schemaRef ds:uri="http://schemas.microsoft.com/office/2006/metadata/properties"/>
-    <ds:schemaRef ds:uri="http://schemas.microsoft.com/office/infopath/2007/PartnerControls"/>
-    <ds:schemaRef ds:uri="06cfe00f-839a-4df9-b5c7-4ebac7d0c360"/>
-    <ds:schemaRef ds:uri="bb952b06-3268-4e55-b0fe-9eb49669fc08"/>
-  </ds:schemaRefs>
-</ds:datastoreItem>
-</file>
-
-<file path=customXml/itemProps3.xml><?xml version="1.0" encoding="utf-8"?>
 <ds:datastoreItem xmlns:ds="http://schemas.openxmlformats.org/officeDocument/2006/customXml" ds:itemID="{D0A1E311-1A65-4002-9E1E-F83F7BD810C8}">
   <ds:schemaRefs>
     <ds:schemaRef ds:uri="http://schemas.microsoft.com/office/2006/metadata/contentType"/>
@@ -2791,4 +2786,15 @@
     <ds:schemaRef ds:uri="http://schemas.microsoft.com/internal/obd"/>
   </ds:schemaRefs>
 </ds:datastoreItem>
+</file>
+
+<file path=customXml/itemProps3.xml><?xml version="1.0" encoding="utf-8"?>
+<ds:datastoreItem xmlns:ds="http://schemas.openxmlformats.org/officeDocument/2006/customXml" ds:itemID="{5F3D02CF-878C-4FC7-BC50-B392CD9CCE23}">
+  <ds:schemaRefs>
+    <ds:schemaRef ds:uri="http://schemas.microsoft.com/office/2006/metadata/properties"/>
+    <ds:schemaRef ds:uri="http://schemas.microsoft.com/office/infopath/2007/PartnerControls"/>
+    <ds:schemaRef ds:uri="06cfe00f-839a-4df9-b5c7-4ebac7d0c360"/>
+    <ds:schemaRef ds:uri="bb952b06-3268-4e55-b0fe-9eb49669fc08"/>
+  </ds:schemaRefs>
+</ds:datastoreItem>
 </file>
</xml_diff>

<commit_message>
Add multi condition letter logic
</commit_message>
<xml_diff>
--- a/arches_her/docx/Condition Historic Building Recording Letter.docx
+++ b/arches_her/docx/Condition Historic Building Recording Letter.docx
@@ -609,20 +609,71 @@
           <w:tab w:val="left" w:pos="5245"/>
         </w:tabs>
         <w:spacing w:after="0" w:line="240" w:lineRule="auto"/>
-      </w:pPr>
-      <w:r>
-        <w:t>NPPF Section 16 and the London Plan (2021 Policy HC1) recognise the positive contribution of heritage assets of all kinds and make the conservation of archaeological interest a material planning consideration.  NPPF paragraph 207 says applicants should provide an archaeological assessment if their development could affect a heritage asset of archaeological interest.   Some historic buildings are of archaeological interest and this interest can be harmed by the loss of historic fabric.</w:t>
-      </w:r>
-    </w:p>
-    <w:p>
-      <w:pPr>
-        <w:tabs>
-          <w:tab w:val="left" w:pos="5245"/>
-        </w:tabs>
-        <w:spacing w:after="0" w:line="240" w:lineRule="auto"/>
-      </w:pPr>
-      <w:r>
+        <w:rPr>
+          <w:rFonts w:cstheme="minorHAnsi"/>
+        </w:rPr>
+      </w:pPr>
+      <w:r>
+        <w:rPr>
+          <w:rFonts w:cstheme="minorHAnsi"/>
+        </w:rPr>
+        <w:t xml:space="preserve">NPPF Section 16 and the London Plan (2021 Policy HC1) recognise the positive contribution of heritage assets of all kinds and make the conservation of archaeological interest a material planning consideration.  NPPF paragraph 207 says applicants should provide an archaeological assessment if their development could affect a heritage asset of archaeological interest.   </w:t>
+      </w:r>
+    </w:p>
+    <w:p>
+      <w:pPr>
+        <w:tabs>
+          <w:tab w:val="left" w:pos="5245"/>
+        </w:tabs>
+        <w:spacing w:after="0" w:line="240" w:lineRule="auto"/>
+        <w:rPr>
+          <w:rFonts w:cstheme="minorHAnsi"/>
+        </w:rPr>
+      </w:pPr>
+    </w:p>
+    <w:p>
+      <w:pPr>
+        <w:tabs>
+          <w:tab w:val="left" w:pos="5245"/>
+        </w:tabs>
+        <w:spacing w:after="0" w:line="240" w:lineRule="auto"/>
+        <w:rPr>
+          <w:rFonts w:cstheme="minorHAnsi"/>
+        </w:rPr>
+      </w:pPr>
+      <w:r>
+        <w:rPr>
+          <w:rFonts w:cstheme="minorHAnsi"/>
+        </w:rPr>
         <w:lastRenderedPageBreak/>
+        <w:t xml:space="preserve">NPPF paragraphs 202 and 210 and London Plan Policy HC1 emphasise the positive contributions heritage assets can make to sustainable communities and places.  Where appropriate, applicants should therefore also expect to identify enhancement opportunities.  </w:t>
+      </w:r>
+    </w:p>
+    <w:p>
+      <w:pPr>
+        <w:tabs>
+          <w:tab w:val="left" w:pos="5245"/>
+        </w:tabs>
+        <w:spacing w:after="0" w:line="240" w:lineRule="auto"/>
+        <w:rPr>
+          <w:rFonts w:cstheme="minorHAnsi"/>
+        </w:rPr>
+      </w:pPr>
+    </w:p>
+    <w:p>
+      <w:pPr>
+        <w:tabs>
+          <w:tab w:val="left" w:pos="5245"/>
+        </w:tabs>
+        <w:spacing w:after="0" w:line="240" w:lineRule="auto"/>
+        <w:rPr>
+          <w:rFonts w:cstheme="minorHAnsi"/>
+        </w:rPr>
+      </w:pPr>
+      <w:r>
+        <w:rPr>
+          <w:rFonts w:cstheme="minorHAnsi"/>
+        </w:rPr>
         <w:t>If you grant planning consent, paragraph 218 of the NPPF says that applicants should record the significance of any heritage assets that the development harms. Applicants should also improve knowledge of assets and make this public.</w:t>
       </w:r>
     </w:p>
@@ -632,6 +683,9 @@
           <w:tab w:val="left" w:pos="5245"/>
         </w:tabs>
         <w:spacing w:after="0" w:line="240" w:lineRule="auto"/>
+        <w:rPr>
+          <w:rFonts w:cstheme="minorHAnsi"/>
+        </w:rPr>
       </w:pPr>
     </w:p>
     <w:p>
@@ -659,101 +713,37 @@
         <w:spacing w:after="0" w:line="240" w:lineRule="auto"/>
       </w:pPr>
       <w:r>
-        <w:t>I advise that the development could cause harm to the archaeological interest of the building(s).  I therefore recommend the following condition on any consent:</w:t>
-      </w:r>
-    </w:p>
-    <w:p>
-      <w:pPr>
-        <w:tabs>
-          <w:tab w:val="left" w:pos="5245"/>
-        </w:tabs>
-        <w:spacing w:after="0" w:line="240" w:lineRule="auto"/>
-      </w:pPr>
-    </w:p>
-    <w:p>
-      <w:pPr>
-        <w:tabs>
-          <w:tab w:val="left" w:pos="5245"/>
-        </w:tabs>
-        <w:spacing w:after="0" w:line="240" w:lineRule="auto"/>
-        <w:ind w:left="1418" w:hanging="1418"/>
-      </w:pPr>
-      <w:r>
-        <w:t>Condition</w:t>
-      </w:r>
-      <w:r>
-        <w:tab/>
-        <w:t>No demolition shall take place until a written scheme of historic building investigation (WSI) has been submitted to and approved by the local planning authority in writing.  For buildings that are included within the WSI, no demolition or development shall take place other than in accordance with the agreed WSI, which shall include the statement of significance and research objectives, and:</w:t>
-      </w:r>
-    </w:p>
-    <w:p>
-      <w:pPr>
-        <w:tabs>
-          <w:tab w:val="left" w:pos="5245"/>
-        </w:tabs>
-        <w:spacing w:after="0" w:line="240" w:lineRule="auto"/>
-        <w:ind w:left="1418" w:hanging="1418"/>
-      </w:pPr>
+        <w:t xml:space="preserve">I advise that the development could cause harm to the archaeological interest of the building(s).  I therefore recommend </w:t>
+      </w:r>
+      <w:r>
+        <w:t>attaching the</w:t>
+      </w:r>
+      <w:r>
+        <w:t xml:space="preserve"> condition</w:t>
+      </w:r>
+      <w:r>
+        <w:t>(s)</w:t>
+      </w:r>
       <w:r>
         <w:t xml:space="preserve"> </w:t>
       </w:r>
-    </w:p>
-    <w:p>
-      <w:pPr>
-        <w:tabs>
-          <w:tab w:val="left" w:pos="5245"/>
-        </w:tabs>
-        <w:spacing w:after="0" w:line="240" w:lineRule="auto"/>
-        <w:ind w:left="1701" w:hanging="283"/>
-      </w:pPr>
-      <w:r>
-        <w:t xml:space="preserve">A. The programme and methodology of historic building investigation and recording and the nomination of a competent person(s) or organisation to undertake the agreed works </w:t>
-      </w:r>
-    </w:p>
-    <w:p>
-      <w:pPr>
-        <w:tabs>
-          <w:tab w:val="left" w:pos="5245"/>
-        </w:tabs>
-        <w:spacing w:after="0" w:line="240" w:lineRule="auto"/>
-        <w:ind w:left="1701" w:hanging="283"/>
-      </w:pPr>
-      <w:r>
-        <w:t xml:space="preserve">B. The programme for post-investigation assessment and subsequent analysis, publication &amp; dissemination and deposition of resulting material. This part of the condition shall not be discharged until these elements have been fulfilled in accordance with the programme set out in the WSI </w:t>
-      </w:r>
-    </w:p>
-    <w:p>
-      <w:pPr>
-        <w:tabs>
-          <w:tab w:val="left" w:pos="5245"/>
-        </w:tabs>
-        <w:spacing w:after="0" w:line="240" w:lineRule="auto"/>
-        <w:ind w:left="1418" w:hanging="1418"/>
-      </w:pPr>
-    </w:p>
-    <w:p>
-      <w:pPr>
-        <w:tabs>
-          <w:tab w:val="left" w:pos="5245"/>
-        </w:tabs>
-        <w:spacing w:after="0" w:line="240" w:lineRule="auto"/>
-        <w:ind w:left="1418" w:hanging="1418"/>
-      </w:pPr>
-      <w:r>
-        <w:t>Informative</w:t>
-      </w:r>
-      <w:r>
-        <w:tab/>
-        <w:t xml:space="preserve">The written scheme of investigation will need to be prepared and implemented by a suitably professionally accredited heritage practice in accordance with Historic England’s Guidelines for Archaeological Projects in Greater London.  </w:t>
-      </w:r>
-    </w:p>
-    <w:p>
-      <w:pPr>
-        <w:tabs>
-          <w:tab w:val="left" w:pos="5245"/>
-        </w:tabs>
-        <w:spacing w:after="0" w:line="240" w:lineRule="auto"/>
-      </w:pPr>
+      <w:r>
+        <w:t>as follows</w:t>
+      </w:r>
+      <w:r>
+        <w:t>:</w:t>
+      </w:r>
+    </w:p>
+    <w:p>
+      <w:pPr>
+        <w:tabs>
+          <w:tab w:val="left" w:pos="5245"/>
+        </w:tabs>
+        <w:spacing w:after="0" w:line="240" w:lineRule="auto"/>
+      </w:pPr>
+      <w:r>
+        <w:t>&lt;Condition&gt;</w:t>
+      </w:r>
     </w:p>
     <w:p>
       <w:pPr>
@@ -918,7 +908,6 @@
         <w:spacing w:after="0" w:line="240" w:lineRule="auto"/>
       </w:pPr>
       <w:r>
-        <w:lastRenderedPageBreak/>
         <w:t>Greater London Archaeological Advisory Service</w:t>
       </w:r>
     </w:p>
@@ -1191,29 +1180,7 @@
         <w:sz w:val="16"/>
         <w:szCs w:val="16"/>
       </w:rPr>
-      <w:t xml:space="preserve">Historic England, 4th Floor, Cannon Bridge House, 25 </w:t>
-    </w:r>
-    <w:proofErr w:type="spellStart"/>
-    <w:r>
-      <w:rPr>
-        <w:rFonts w:ascii="Arial" w:hAnsi="Arial"/>
-        <w:b/>
-        <w:bCs/>
-        <w:sz w:val="16"/>
-        <w:szCs w:val="16"/>
-      </w:rPr>
-      <w:t>Dowgate</w:t>
-    </w:r>
-    <w:proofErr w:type="spellEnd"/>
-    <w:r>
-      <w:rPr>
-        <w:rFonts w:ascii="Arial" w:hAnsi="Arial"/>
-        <w:b/>
-        <w:bCs/>
-        <w:sz w:val="16"/>
-        <w:szCs w:val="16"/>
-      </w:rPr>
-      <w:t xml:space="preserve"> Hill, London EC4R 2YA</w:t>
+      <w:t>Historic England, 4th Floor, Cannon Bridge House, 25 Dowgate Hill, London EC4R 2YA</w:t>
     </w:r>
     <w:r>
       <w:rPr>
@@ -2983,30 +2950,6 @@
 </file>
 
 <file path=customXml/item1.xml><?xml version="1.0" encoding="utf-8"?>
-<b:Sources xmlns:b="http://schemas.openxmlformats.org/officeDocument/2006/bibliography" xmlns="http://schemas.openxmlformats.org/officeDocument/2006/bibliography" SelectedStyle="/APASixthEditionOfficeOnline.xsl" StyleName="APA" Version="6"/>
-</file>
-
-<file path=customXml/item2.xml><?xml version="1.0" encoding="utf-8"?>
-<p:properties xmlns:p="http://schemas.microsoft.com/office/2006/metadata/properties" xmlns:xsi="http://www.w3.org/2001/XMLSchema-instance" xmlns:pc="http://schemas.microsoft.com/office/infopath/2007/PartnerControls">
-  <documentManagement>
-    <lcf76f155ced4ddcb4097134ff3c332f xmlns="e789b7fa-a83c-4c6b-9e01-87c723f67228">
-      <Terms xmlns="http://schemas.microsoft.com/office/infopath/2007/PartnerControls"/>
-    </lcf76f155ced4ddcb4097134ff3c332f>
-    <TaxCatchAll xmlns="bb952b06-3268-4e55-b0fe-9eb49669fc08" xsi:nil="true"/>
-  </documentManagement>
-</p:properties>
-</file>
-
-<file path=customXml/item3.xml><?xml version="1.0" encoding="utf-8"?>
-<?mso-contentType ?>
-<FormTemplates xmlns="http://schemas.microsoft.com/sharepoint/v3/contenttype/forms">
-  <Display>DocumentLibraryForm</Display>
-  <Edit>DocumentLibraryForm</Edit>
-  <New>DocumentLibraryForm</New>
-</FormTemplates>
-</file>
-
-<file path=customXml/item4.xml><?xml version="1.0" encoding="utf-8"?>
 <ct:contentTypeSchema xmlns:ct="http://schemas.microsoft.com/office/2006/metadata/contentType" xmlns:ma="http://schemas.microsoft.com/office/2006/metadata/properties/metaAttributes" ct:_="" ma:_="" ma:contentTypeName="Document" ma:contentTypeID="0x010100B89331DE8EA64F4FBEA00113BF0E4514" ma:contentTypeVersion="11" ma:contentTypeDescription="Create a new document." ma:contentTypeScope="" ma:versionID="0b60b04e60edb8b2e7e2fe1cc7d413e0">
   <xsd:schema xmlns:xsd="http://www.w3.org/2001/XMLSchema" xmlns:xs="http://www.w3.org/2001/XMLSchema" xmlns:p="http://schemas.microsoft.com/office/2006/metadata/properties" xmlns:ns2="e789b7fa-a83c-4c6b-9e01-87c723f67228" xmlns:ns3="bb952b06-3268-4e55-b0fe-9eb49669fc08" targetNamespace="http://schemas.microsoft.com/office/2006/metadata/properties" ma:root="true" ma:fieldsID="52467e30880403e5f73a15b97b0992c8" ns2:_="" ns3:_="">
     <xsd:import namespace="e789b7fa-a83c-4c6b-9e01-87c723f67228"/>
@@ -3201,34 +3144,31 @@
 </ct:contentTypeSchema>
 </file>
 
-<file path=customXml/itemProps1.xml><?xml version="1.0" encoding="utf-8"?>
-<ds:datastoreItem xmlns:ds="http://schemas.openxmlformats.org/officeDocument/2006/customXml" ds:itemID="{3B4892E8-18D6-D444-BA6E-299F0B60384F}">
-  <ds:schemaRefs>
-    <ds:schemaRef ds:uri="http://schemas.openxmlformats.org/officeDocument/2006/bibliography"/>
-  </ds:schemaRefs>
-</ds:datastoreItem>
+<file path=customXml/item2.xml><?xml version="1.0" encoding="utf-8"?>
+<?mso-contentType ?>
+<FormTemplates xmlns="http://schemas.microsoft.com/sharepoint/v3/contenttype/forms">
+  <Display>DocumentLibraryForm</Display>
+  <Edit>DocumentLibraryForm</Edit>
+  <New>DocumentLibraryForm</New>
+</FormTemplates>
 </file>
 
-<file path=customXml/itemProps2.xml><?xml version="1.0" encoding="utf-8"?>
-<ds:datastoreItem xmlns:ds="http://schemas.openxmlformats.org/officeDocument/2006/customXml" ds:itemID="{EF43FDED-CD1D-4301-B761-71C1DCC851CC}">
-  <ds:schemaRefs>
-    <ds:schemaRef ds:uri="http://schemas.microsoft.com/office/2006/metadata/properties"/>
-    <ds:schemaRef ds:uri="http://schemas.microsoft.com/office/infopath/2007/PartnerControls"/>
-    <ds:schemaRef ds:uri="e789b7fa-a83c-4c6b-9e01-87c723f67228"/>
-    <ds:schemaRef ds:uri="bb952b06-3268-4e55-b0fe-9eb49669fc08"/>
-  </ds:schemaRefs>
-</ds:datastoreItem>
+<file path=customXml/item3.xml><?xml version="1.0" encoding="utf-8"?>
+<p:properties xmlns:p="http://schemas.microsoft.com/office/2006/metadata/properties" xmlns:xsi="http://www.w3.org/2001/XMLSchema-instance" xmlns:pc="http://schemas.microsoft.com/office/infopath/2007/PartnerControls">
+  <documentManagement>
+    <lcf76f155ced4ddcb4097134ff3c332f xmlns="e789b7fa-a83c-4c6b-9e01-87c723f67228">
+      <Terms xmlns="http://schemas.microsoft.com/office/infopath/2007/PartnerControls"/>
+    </lcf76f155ced4ddcb4097134ff3c332f>
+    <TaxCatchAll xmlns="bb952b06-3268-4e55-b0fe-9eb49669fc08" xsi:nil="true"/>
+  </documentManagement>
+</p:properties>
 </file>
 
-<file path=customXml/itemProps3.xml><?xml version="1.0" encoding="utf-8"?>
-<ds:datastoreItem xmlns:ds="http://schemas.openxmlformats.org/officeDocument/2006/customXml" ds:itemID="{45FB1F57-968F-4A6E-AEE9-65961EB5FADD}">
-  <ds:schemaRefs>
-    <ds:schemaRef ds:uri="http://schemas.microsoft.com/sharepoint/v3/contenttype/forms"/>
-  </ds:schemaRefs>
-</ds:datastoreItem>
+<file path=customXml/item4.xml><?xml version="1.0" encoding="utf-8"?>
+<b:Sources xmlns:b="http://schemas.openxmlformats.org/officeDocument/2006/bibliography" xmlns="http://schemas.openxmlformats.org/officeDocument/2006/bibliography" SelectedStyle="/APASixthEditionOfficeOnline.xsl" StyleName="APA" Version="6"/>
 </file>
 
-<file path=customXml/itemProps4.xml><?xml version="1.0" encoding="utf-8"?>
+<file path=customXml/itemProps1.xml><?xml version="1.0" encoding="utf-8"?>
 <ds:datastoreItem xmlns:ds="http://schemas.openxmlformats.org/officeDocument/2006/customXml" ds:itemID="{93F00A47-6514-4C46-91C6-8D2331E8318E}">
   <ds:schemaRefs>
     <ds:schemaRef ds:uri="http://schemas.microsoft.com/office/2006/metadata/contentType"/>
@@ -3245,4 +3185,31 @@
     <ds:schemaRef ds:uri="http://schemas.microsoft.com/internal/obd"/>
   </ds:schemaRefs>
 </ds:datastoreItem>
+</file>
+
+<file path=customXml/itemProps2.xml><?xml version="1.0" encoding="utf-8"?>
+<ds:datastoreItem xmlns:ds="http://schemas.openxmlformats.org/officeDocument/2006/customXml" ds:itemID="{45FB1F57-968F-4A6E-AEE9-65961EB5FADD}">
+  <ds:schemaRefs>
+    <ds:schemaRef ds:uri="http://schemas.microsoft.com/sharepoint/v3/contenttype/forms"/>
+  </ds:schemaRefs>
+</ds:datastoreItem>
+</file>
+
+<file path=customXml/itemProps3.xml><?xml version="1.0" encoding="utf-8"?>
+<ds:datastoreItem xmlns:ds="http://schemas.openxmlformats.org/officeDocument/2006/customXml" ds:itemID="{EF43FDED-CD1D-4301-B761-71C1DCC851CC}">
+  <ds:schemaRefs>
+    <ds:schemaRef ds:uri="http://schemas.microsoft.com/office/2006/metadata/properties"/>
+    <ds:schemaRef ds:uri="http://schemas.microsoft.com/office/infopath/2007/PartnerControls"/>
+    <ds:schemaRef ds:uri="e789b7fa-a83c-4c6b-9e01-87c723f67228"/>
+    <ds:schemaRef ds:uri="bb952b06-3268-4e55-b0fe-9eb49669fc08"/>
+  </ds:schemaRefs>
+</ds:datastoreItem>
+</file>
+
+<file path=customXml/itemProps4.xml><?xml version="1.0" encoding="utf-8"?>
+<ds:datastoreItem xmlns:ds="http://schemas.openxmlformats.org/officeDocument/2006/customXml" ds:itemID="{3B4892E8-18D6-D444-BA6E-299F0B60384F}">
+  <ds:schemaRefs>
+    <ds:schemaRef ds:uri="http://schemas.openxmlformats.org/officeDocument/2006/bibliography"/>
+  </ds:schemaRefs>
+</ds:datastoreItem>
 </file>
</xml_diff>

<commit_message>
Update letters with new conditions paragraph from Greer
</commit_message>
<xml_diff>
--- a/arches_her/docx/Condition Historic Building Recording Letter.docx
+++ b/arches_her/docx/Condition Historic Building Recording Letter.docx
@@ -753,7 +753,15 @@
         <w:spacing w:after="0" w:line="240" w:lineRule="auto"/>
       </w:pPr>
       <w:r>
-        <w:t>This pre-commencement condition is necessary to safeguard the archaeological interest on this site.  Approval of the WSI before works begin on site provides clarity on what investigations are required, and their timing in relation to the development programme.   If the applicant does not agree to this pre-commencement condition, please let us know their reasons and any alternatives suggested.   Without this pre-commencement condition being imposed the application should be refused as it would not comply with NPPF paragraph 218.</w:t>
+        <w:t xml:space="preserve">Pre-commencement conditions are necessary to safeguard the archaeological interest on sites. Approval of a WSI before works begin on site provides clarity on what investigations are required, and their timing in relation to the development programme. If the applicant does not agree to a pre-commencement </w:t>
+      </w:r>
+      <w:proofErr w:type="gramStart"/>
+      <w:r>
+        <w:t>condition</w:t>
+      </w:r>
+      <w:proofErr w:type="gramEnd"/>
+      <w:r>
+        <w:t xml:space="preserve"> please let us know their reasons and any alternatives suggested. Without the recommended pre-commencement condition(s) being imposed the application should be refused as it would not comply with NPPF paragraph 218.</w:t>
       </w:r>
     </w:p>
     <w:p>
@@ -919,7 +927,15 @@
         <w:spacing w:after="0" w:line="240" w:lineRule="auto"/>
       </w:pPr>
       <w:r>
-        <w:t>London and South East Region</w:t>
+        <w:t xml:space="preserve">London and </w:t>
+      </w:r>
+      <w:proofErr w:type="gramStart"/>
+      <w:r>
+        <w:t>South East</w:t>
+      </w:r>
+      <w:proofErr w:type="gramEnd"/>
+      <w:r>
+        <w:t xml:space="preserve"> Region</w:t>
       </w:r>
     </w:p>
     <w:p>
@@ -2276,7 +2292,6 @@
   <w:style w:type="character" w:default="1" w:styleId="DefaultParagraphFont">
     <w:name w:val="Default Paragraph Font"/>
     <w:uiPriority w:val="1"/>
-    <w:semiHidden/>
     <w:unhideWhenUsed/>
   </w:style>
   <w:style w:type="table" w:default="1" w:styleId="TableNormal">
@@ -2950,6 +2965,26 @@
 </file>
 
 <file path=customXml/item1.xml><?xml version="1.0" encoding="utf-8"?>
+<p:properties xmlns:p="http://schemas.microsoft.com/office/2006/metadata/properties" xmlns:xsi="http://www.w3.org/2001/XMLSchema-instance" xmlns:pc="http://schemas.microsoft.com/office/infopath/2007/PartnerControls">
+  <documentManagement>
+    <lcf76f155ced4ddcb4097134ff3c332f xmlns="e789b7fa-a83c-4c6b-9e01-87c723f67228">
+      <Terms xmlns="http://schemas.microsoft.com/office/infopath/2007/PartnerControls"/>
+    </lcf76f155ced4ddcb4097134ff3c332f>
+    <TaxCatchAll xmlns="bb952b06-3268-4e55-b0fe-9eb49669fc08" xsi:nil="true"/>
+  </documentManagement>
+</p:properties>
+</file>
+
+<file path=customXml/item2.xml><?xml version="1.0" encoding="utf-8"?>
+<?mso-contentType ?>
+<FormTemplates xmlns="http://schemas.microsoft.com/sharepoint/v3/contenttype/forms">
+  <Display>DocumentLibraryForm</Display>
+  <Edit>DocumentLibraryForm</Edit>
+  <New>DocumentLibraryForm</New>
+</FormTemplates>
+</file>
+
+<file path=customXml/item3.xml><?xml version="1.0" encoding="utf-8"?>
 <ct:contentTypeSchema xmlns:ct="http://schemas.microsoft.com/office/2006/metadata/contentType" xmlns:ma="http://schemas.microsoft.com/office/2006/metadata/properties/metaAttributes" ct:_="" ma:_="" ma:contentTypeName="Document" ma:contentTypeID="0x010100B89331DE8EA64F4FBEA00113BF0E4514" ma:contentTypeVersion="11" ma:contentTypeDescription="Create a new document." ma:contentTypeScope="" ma:versionID="0b60b04e60edb8b2e7e2fe1cc7d413e0">
   <xsd:schema xmlns:xsd="http://www.w3.org/2001/XMLSchema" xmlns:xs="http://www.w3.org/2001/XMLSchema" xmlns:p="http://schemas.microsoft.com/office/2006/metadata/properties" xmlns:ns2="e789b7fa-a83c-4c6b-9e01-87c723f67228" xmlns:ns3="bb952b06-3268-4e55-b0fe-9eb49669fc08" targetNamespace="http://schemas.microsoft.com/office/2006/metadata/properties" ma:root="true" ma:fieldsID="52467e30880403e5f73a15b97b0992c8" ns2:_="" ns3:_="">
     <xsd:import namespace="e789b7fa-a83c-4c6b-9e01-87c723f67228"/>
@@ -3144,31 +3179,30 @@
 </ct:contentTypeSchema>
 </file>
 
-<file path=customXml/item2.xml><?xml version="1.0" encoding="utf-8"?>
-<?mso-contentType ?>
-<FormTemplates xmlns="http://schemas.microsoft.com/sharepoint/v3/contenttype/forms">
-  <Display>DocumentLibraryForm</Display>
-  <Edit>DocumentLibraryForm</Edit>
-  <New>DocumentLibraryForm</New>
-</FormTemplates>
-</file>
-
-<file path=customXml/item3.xml><?xml version="1.0" encoding="utf-8"?>
-<p:properties xmlns:p="http://schemas.microsoft.com/office/2006/metadata/properties" xmlns:xsi="http://www.w3.org/2001/XMLSchema-instance" xmlns:pc="http://schemas.microsoft.com/office/infopath/2007/PartnerControls">
-  <documentManagement>
-    <lcf76f155ced4ddcb4097134ff3c332f xmlns="e789b7fa-a83c-4c6b-9e01-87c723f67228">
-      <Terms xmlns="http://schemas.microsoft.com/office/infopath/2007/PartnerControls"/>
-    </lcf76f155ced4ddcb4097134ff3c332f>
-    <TaxCatchAll xmlns="bb952b06-3268-4e55-b0fe-9eb49669fc08" xsi:nil="true"/>
-  </documentManagement>
-</p:properties>
-</file>
-
 <file path=customXml/item4.xml><?xml version="1.0" encoding="utf-8"?>
 <b:Sources xmlns:b="http://schemas.openxmlformats.org/officeDocument/2006/bibliography" xmlns="http://schemas.openxmlformats.org/officeDocument/2006/bibliography" SelectedStyle="/APASixthEditionOfficeOnline.xsl" StyleName="APA" Version="6"/>
 </file>
 
 <file path=customXml/itemProps1.xml><?xml version="1.0" encoding="utf-8"?>
+<ds:datastoreItem xmlns:ds="http://schemas.openxmlformats.org/officeDocument/2006/customXml" ds:itemID="{EF43FDED-CD1D-4301-B761-71C1DCC851CC}">
+  <ds:schemaRefs>
+    <ds:schemaRef ds:uri="http://schemas.microsoft.com/office/2006/metadata/properties"/>
+    <ds:schemaRef ds:uri="http://schemas.microsoft.com/office/infopath/2007/PartnerControls"/>
+    <ds:schemaRef ds:uri="e789b7fa-a83c-4c6b-9e01-87c723f67228"/>
+    <ds:schemaRef ds:uri="bb952b06-3268-4e55-b0fe-9eb49669fc08"/>
+  </ds:schemaRefs>
+</ds:datastoreItem>
+</file>
+
+<file path=customXml/itemProps2.xml><?xml version="1.0" encoding="utf-8"?>
+<ds:datastoreItem xmlns:ds="http://schemas.openxmlformats.org/officeDocument/2006/customXml" ds:itemID="{45FB1F57-968F-4A6E-AEE9-65961EB5FADD}">
+  <ds:schemaRefs>
+    <ds:schemaRef ds:uri="http://schemas.microsoft.com/sharepoint/v3/contenttype/forms"/>
+  </ds:schemaRefs>
+</ds:datastoreItem>
+</file>
+
+<file path=customXml/itemProps3.xml><?xml version="1.0" encoding="utf-8"?>
 <ds:datastoreItem xmlns:ds="http://schemas.openxmlformats.org/officeDocument/2006/customXml" ds:itemID="{93F00A47-6514-4C46-91C6-8D2331E8318E}">
   <ds:schemaRefs>
     <ds:schemaRef ds:uri="http://schemas.microsoft.com/office/2006/metadata/contentType"/>
@@ -3187,25 +3221,6 @@
 </ds:datastoreItem>
 </file>
 
-<file path=customXml/itemProps2.xml><?xml version="1.0" encoding="utf-8"?>
-<ds:datastoreItem xmlns:ds="http://schemas.openxmlformats.org/officeDocument/2006/customXml" ds:itemID="{45FB1F57-968F-4A6E-AEE9-65961EB5FADD}">
-  <ds:schemaRefs>
-    <ds:schemaRef ds:uri="http://schemas.microsoft.com/sharepoint/v3/contenttype/forms"/>
-  </ds:schemaRefs>
-</ds:datastoreItem>
-</file>
-
-<file path=customXml/itemProps3.xml><?xml version="1.0" encoding="utf-8"?>
-<ds:datastoreItem xmlns:ds="http://schemas.openxmlformats.org/officeDocument/2006/customXml" ds:itemID="{EF43FDED-CD1D-4301-B761-71C1DCC851CC}">
-  <ds:schemaRefs>
-    <ds:schemaRef ds:uri="http://schemas.microsoft.com/office/2006/metadata/properties"/>
-    <ds:schemaRef ds:uri="http://schemas.microsoft.com/office/infopath/2007/PartnerControls"/>
-    <ds:schemaRef ds:uri="e789b7fa-a83c-4c6b-9e01-87c723f67228"/>
-    <ds:schemaRef ds:uri="bb952b06-3268-4e55-b0fe-9eb49669fc08"/>
-  </ds:schemaRefs>
-</ds:datastoreItem>
-</file>
-
 <file path=customXml/itemProps4.xml><?xml version="1.0" encoding="utf-8"?>
 <ds:datastoreItem xmlns:ds="http://schemas.openxmlformats.org/officeDocument/2006/customXml" ds:itemID="{3B4892E8-18D6-D444-BA6E-299F0B60384F}">
   <ds:schemaRefs>

</xml_diff>